<commit_message>
Aggiunta spiegazione Diario Docker-compose.override
</commit_message>
<xml_diff>
--- a/Diario-Docker.docx
+++ b/Diario-Docker.docx
@@ -176,10 +176,7 @@
         <w:t>licativo</w:t>
       </w:r>
       <w:r>
-        <w:t xml:space="preserve"> </w:t>
-      </w:r>
-      <w:r>
-        <w:t>è volutamente piccolo</w:t>
+        <w:t xml:space="preserve"> è volutamente piccolo</w:t>
       </w:r>
       <w:r>
         <w:t>.</w:t>
@@ -1046,6 +1043,173 @@
         <w:t>, basta scrivere networks: - chat-net e lo raggiungo per nome come gli altri.</w:t>
       </w:r>
     </w:p>
+    <w:p/>
+    <w:p>
+      <w:pPr>
+        <w:rPr>
+          <w:sz w:val="36"/>
+          <w:szCs w:val="36"/>
+        </w:rPr>
+      </w:pPr>
+      <w:r>
+        <w:rPr>
+          <w:b/>
+          <w:bCs/>
+          <w:sz w:val="36"/>
+          <w:szCs w:val="36"/>
+        </w:rPr>
+        <w:t>D</w:t>
+      </w:r>
+      <w:r>
+        <w:rPr>
+          <w:b/>
+          <w:bCs/>
+          <w:sz w:val="36"/>
+          <w:szCs w:val="36"/>
+        </w:rPr>
+        <w:t>ocker-</w:t>
+      </w:r>
+      <w:proofErr w:type="spellStart"/>
+      <w:proofErr w:type="gramStart"/>
+      <w:r>
+        <w:rPr>
+          <w:b/>
+          <w:bCs/>
+          <w:sz w:val="36"/>
+          <w:szCs w:val="36"/>
+        </w:rPr>
+        <w:t>compose.override</w:t>
+      </w:r>
+      <w:proofErr w:type="spellEnd"/>
+      <w:proofErr w:type="gramEnd"/>
+    </w:p>
+    <w:p>
+      <w:pPr>
+        <w:numPr>
+          <w:ilvl w:val="0"/>
+          <w:numId w:val="11"/>
+        </w:numPr>
+      </w:pPr>
+      <w:r>
+        <w:t xml:space="preserve">Ho messo il </w:t>
+      </w:r>
+      <w:proofErr w:type="spellStart"/>
+      <w:r>
+        <w:t>bind</w:t>
+      </w:r>
+      <w:proofErr w:type="spellEnd"/>
+      <w:r>
+        <w:t xml:space="preserve"> </w:t>
+      </w:r>
+      <w:proofErr w:type="spellStart"/>
+      <w:proofErr w:type="gramStart"/>
+      <w:r>
+        <w:t>mount</w:t>
+      </w:r>
+      <w:proofErr w:type="spellEnd"/>
+      <w:r>
+        <w:t xml:space="preserve"> .</w:t>
+      </w:r>
+      <w:proofErr w:type="gramEnd"/>
+      <w:r>
+        <w:t>/</w:t>
+      </w:r>
+      <w:proofErr w:type="spellStart"/>
+      <w:r>
+        <w:t>src</w:t>
+      </w:r>
+      <w:proofErr w:type="spellEnd"/>
+      <w:r>
+        <w:t>:/var/www/html in un file a parte, perché serve solo per sviluppare</w:t>
+      </w:r>
+      <w:r>
+        <w:t>. Quindi l’ho fatto solo alla fine quando sapevo che tutto funzionasse.</w:t>
+      </w:r>
+    </w:p>
+    <w:p>
+      <w:pPr>
+        <w:numPr>
+          <w:ilvl w:val="0"/>
+          <w:numId w:val="11"/>
+        </w:numPr>
+      </w:pPr>
+      <w:r>
+        <w:t xml:space="preserve">Nel </w:t>
+      </w:r>
+      <w:proofErr w:type="spellStart"/>
+      <w:r>
+        <w:t>docker-compose.yml</w:t>
+      </w:r>
+      <w:proofErr w:type="spellEnd"/>
+      <w:r>
+        <w:t xml:space="preserve"> principale non c'è, perché il codice è già dentro l'immagine (con il COPY) e su un'altra macchina, come </w:t>
+      </w:r>
+      <w:proofErr w:type="spellStart"/>
+      <w:r>
+        <w:t>Portainer</w:t>
+      </w:r>
+      <w:proofErr w:type="spellEnd"/>
+      <w:r>
+        <w:t xml:space="preserve">, la mia cartella </w:t>
+      </w:r>
+      <w:proofErr w:type="spellStart"/>
+      <w:r>
+        <w:t>src</w:t>
+      </w:r>
+      <w:proofErr w:type="spellEnd"/>
+      <w:r>
+        <w:t xml:space="preserve"> non esiste.</w:t>
+      </w:r>
+    </w:p>
+    <w:p>
+      <w:pPr>
+        <w:numPr>
+          <w:ilvl w:val="0"/>
+          <w:numId w:val="11"/>
+        </w:numPr>
+      </w:pPr>
+      <w:r>
+        <w:t>Compose legge l'</w:t>
+      </w:r>
+      <w:proofErr w:type="spellStart"/>
+      <w:r>
+        <w:t>override</w:t>
+      </w:r>
+      <w:proofErr w:type="spellEnd"/>
+      <w:r>
+        <w:t xml:space="preserve"> da solo quando scrivo </w:t>
+      </w:r>
+      <w:proofErr w:type="spellStart"/>
+      <w:r>
+        <w:rPr>
+          <w:i/>
+          <w:iCs/>
+          <w:u w:val="single"/>
+        </w:rPr>
+        <w:t>docker</w:t>
+      </w:r>
+      <w:proofErr w:type="spellEnd"/>
+      <w:r>
+        <w:rPr>
+          <w:i/>
+          <w:iCs/>
+          <w:u w:val="single"/>
+        </w:rPr>
+        <w:t xml:space="preserve"> compose up</w:t>
+      </w:r>
+      <w:r>
+        <w:t xml:space="preserve">, mentre </w:t>
+      </w:r>
+      <w:proofErr w:type="spellStart"/>
+      <w:r>
+        <w:t>Portainer</w:t>
+      </w:r>
+      <w:proofErr w:type="spellEnd"/>
+      <w:r>
+        <w:t xml:space="preserve"> usa solo il file principale.</w:t>
+      </w:r>
+    </w:p>
+    <w:p/>
     <w:p>
       <w:proofErr w:type="gramStart"/>
       <w:r>
@@ -2469,6 +2633,155 @@
     </w:lvl>
   </w:abstractNum>
   <w:abstractNum w:abstractNumId="1" w15:restartNumberingAfterBreak="0">
+    <w:nsid w:val="20B45A7B"/>
+    <w:multiLevelType w:val="multilevel"/>
+    <w:tmpl w:val="DCB495B4"/>
+    <w:lvl w:ilvl="0">
+      <w:start w:val="1"/>
+      <w:numFmt w:val="bullet"/>
+      <w:lvlText w:val=""/>
+      <w:lvlJc w:val="left"/>
+      <w:pPr>
+        <w:tabs>
+          <w:tab w:val="num" w:pos="720"/>
+        </w:tabs>
+        <w:ind w:left="720" w:hanging="360"/>
+      </w:pPr>
+      <w:rPr>
+        <w:rFonts w:ascii="Symbol" w:hAnsi="Symbol" w:hint="default"/>
+        <w:sz w:val="20"/>
+      </w:rPr>
+    </w:lvl>
+    <w:lvl w:ilvl="1" w:tentative="1">
+      <w:start w:val="1"/>
+      <w:numFmt w:val="bullet"/>
+      <w:lvlText w:val="o"/>
+      <w:lvlJc w:val="left"/>
+      <w:pPr>
+        <w:tabs>
+          <w:tab w:val="num" w:pos="1440"/>
+        </w:tabs>
+        <w:ind w:left="1440" w:hanging="360"/>
+      </w:pPr>
+      <w:rPr>
+        <w:rFonts w:ascii="Courier New" w:hAnsi="Courier New" w:hint="default"/>
+        <w:sz w:val="20"/>
+      </w:rPr>
+    </w:lvl>
+    <w:lvl w:ilvl="2" w:tentative="1">
+      <w:start w:val="1"/>
+      <w:numFmt w:val="bullet"/>
+      <w:lvlText w:val=""/>
+      <w:lvlJc w:val="left"/>
+      <w:pPr>
+        <w:tabs>
+          <w:tab w:val="num" w:pos="2160"/>
+        </w:tabs>
+        <w:ind w:left="2160" w:hanging="360"/>
+      </w:pPr>
+      <w:rPr>
+        <w:rFonts w:ascii="Wingdings" w:hAnsi="Wingdings" w:hint="default"/>
+        <w:sz w:val="20"/>
+      </w:rPr>
+    </w:lvl>
+    <w:lvl w:ilvl="3" w:tentative="1">
+      <w:start w:val="1"/>
+      <w:numFmt w:val="bullet"/>
+      <w:lvlText w:val=""/>
+      <w:lvlJc w:val="left"/>
+      <w:pPr>
+        <w:tabs>
+          <w:tab w:val="num" w:pos="2880"/>
+        </w:tabs>
+        <w:ind w:left="2880" w:hanging="360"/>
+      </w:pPr>
+      <w:rPr>
+        <w:rFonts w:ascii="Wingdings" w:hAnsi="Wingdings" w:hint="default"/>
+        <w:sz w:val="20"/>
+      </w:rPr>
+    </w:lvl>
+    <w:lvl w:ilvl="4" w:tentative="1">
+      <w:start w:val="1"/>
+      <w:numFmt w:val="bullet"/>
+      <w:lvlText w:val=""/>
+      <w:lvlJc w:val="left"/>
+      <w:pPr>
+        <w:tabs>
+          <w:tab w:val="num" w:pos="3600"/>
+        </w:tabs>
+        <w:ind w:left="3600" w:hanging="360"/>
+      </w:pPr>
+      <w:rPr>
+        <w:rFonts w:ascii="Wingdings" w:hAnsi="Wingdings" w:hint="default"/>
+        <w:sz w:val="20"/>
+      </w:rPr>
+    </w:lvl>
+    <w:lvl w:ilvl="5" w:tentative="1">
+      <w:start w:val="1"/>
+      <w:numFmt w:val="bullet"/>
+      <w:lvlText w:val=""/>
+      <w:lvlJc w:val="left"/>
+      <w:pPr>
+        <w:tabs>
+          <w:tab w:val="num" w:pos="4320"/>
+        </w:tabs>
+        <w:ind w:left="4320" w:hanging="360"/>
+      </w:pPr>
+      <w:rPr>
+        <w:rFonts w:ascii="Wingdings" w:hAnsi="Wingdings" w:hint="default"/>
+        <w:sz w:val="20"/>
+      </w:rPr>
+    </w:lvl>
+    <w:lvl w:ilvl="6" w:tentative="1">
+      <w:start w:val="1"/>
+      <w:numFmt w:val="bullet"/>
+      <w:lvlText w:val=""/>
+      <w:lvlJc w:val="left"/>
+      <w:pPr>
+        <w:tabs>
+          <w:tab w:val="num" w:pos="5040"/>
+        </w:tabs>
+        <w:ind w:left="5040" w:hanging="360"/>
+      </w:pPr>
+      <w:rPr>
+        <w:rFonts w:ascii="Wingdings" w:hAnsi="Wingdings" w:hint="default"/>
+        <w:sz w:val="20"/>
+      </w:rPr>
+    </w:lvl>
+    <w:lvl w:ilvl="7" w:tentative="1">
+      <w:start w:val="1"/>
+      <w:numFmt w:val="bullet"/>
+      <w:lvlText w:val=""/>
+      <w:lvlJc w:val="left"/>
+      <w:pPr>
+        <w:tabs>
+          <w:tab w:val="num" w:pos="5760"/>
+        </w:tabs>
+        <w:ind w:left="5760" w:hanging="360"/>
+      </w:pPr>
+      <w:rPr>
+        <w:rFonts w:ascii="Wingdings" w:hAnsi="Wingdings" w:hint="default"/>
+        <w:sz w:val="20"/>
+      </w:rPr>
+    </w:lvl>
+    <w:lvl w:ilvl="8" w:tentative="1">
+      <w:start w:val="1"/>
+      <w:numFmt w:val="bullet"/>
+      <w:lvlText w:val=""/>
+      <w:lvlJc w:val="left"/>
+      <w:pPr>
+        <w:tabs>
+          <w:tab w:val="num" w:pos="6480"/>
+        </w:tabs>
+        <w:ind w:left="6480" w:hanging="360"/>
+      </w:pPr>
+      <w:rPr>
+        <w:rFonts w:ascii="Wingdings" w:hAnsi="Wingdings" w:hint="default"/>
+        <w:sz w:val="20"/>
+      </w:rPr>
+    </w:lvl>
+  </w:abstractNum>
+  <w:abstractNum w:abstractNumId="2" w15:restartNumberingAfterBreak="0">
     <w:nsid w:val="251A0ABB"/>
     <w:multiLevelType w:val="multilevel"/>
     <w:tmpl w:val="A87658EA"/>
@@ -2617,7 +2930,7 @@
       </w:rPr>
     </w:lvl>
   </w:abstractNum>
-  <w:abstractNum w:abstractNumId="2" w15:restartNumberingAfterBreak="0">
+  <w:abstractNum w:abstractNumId="3" w15:restartNumberingAfterBreak="0">
     <w:nsid w:val="37DE09BD"/>
     <w:multiLevelType w:val="multilevel"/>
     <w:tmpl w:val="A1A6EF42"/>
@@ -2766,7 +3079,7 @@
       </w:rPr>
     </w:lvl>
   </w:abstractNum>
-  <w:abstractNum w:abstractNumId="3" w15:restartNumberingAfterBreak="0">
+  <w:abstractNum w:abstractNumId="4" w15:restartNumberingAfterBreak="0">
     <w:nsid w:val="436777FA"/>
     <w:multiLevelType w:val="multilevel"/>
     <w:tmpl w:val="F29AB4D6"/>
@@ -2915,7 +3228,7 @@
       </w:rPr>
     </w:lvl>
   </w:abstractNum>
-  <w:abstractNum w:abstractNumId="4" w15:restartNumberingAfterBreak="0">
+  <w:abstractNum w:abstractNumId="5" w15:restartNumberingAfterBreak="0">
     <w:nsid w:val="44D6116A"/>
     <w:multiLevelType w:val="multilevel"/>
     <w:tmpl w:val="8B7697E0"/>
@@ -3064,7 +3377,7 @@
       </w:rPr>
     </w:lvl>
   </w:abstractNum>
-  <w:abstractNum w:abstractNumId="5" w15:restartNumberingAfterBreak="0">
+  <w:abstractNum w:abstractNumId="6" w15:restartNumberingAfterBreak="0">
     <w:nsid w:val="49840F22"/>
     <w:multiLevelType w:val="multilevel"/>
     <w:tmpl w:val="65F87136"/>
@@ -3213,7 +3526,7 @@
       </w:rPr>
     </w:lvl>
   </w:abstractNum>
-  <w:abstractNum w:abstractNumId="6" w15:restartNumberingAfterBreak="0">
+  <w:abstractNum w:abstractNumId="7" w15:restartNumberingAfterBreak="0">
     <w:nsid w:val="4CE23DDA"/>
     <w:multiLevelType w:val="multilevel"/>
     <w:tmpl w:val="125A8D6C"/>
@@ -3362,7 +3675,7 @@
       </w:rPr>
     </w:lvl>
   </w:abstractNum>
-  <w:abstractNum w:abstractNumId="7" w15:restartNumberingAfterBreak="0">
+  <w:abstractNum w:abstractNumId="8" w15:restartNumberingAfterBreak="0">
     <w:nsid w:val="5114397D"/>
     <w:multiLevelType w:val="multilevel"/>
     <w:tmpl w:val="83A6E5A4"/>
@@ -3511,7 +3824,7 @@
       </w:rPr>
     </w:lvl>
   </w:abstractNum>
-  <w:abstractNum w:abstractNumId="8" w15:restartNumberingAfterBreak="0">
+  <w:abstractNum w:abstractNumId="9" w15:restartNumberingAfterBreak="0">
     <w:nsid w:val="54A632A1"/>
     <w:multiLevelType w:val="multilevel"/>
     <w:tmpl w:val="1CB22A8E"/>
@@ -3660,7 +3973,7 @@
       </w:rPr>
     </w:lvl>
   </w:abstractNum>
-  <w:abstractNum w:abstractNumId="9" w15:restartNumberingAfterBreak="0">
+  <w:abstractNum w:abstractNumId="10" w15:restartNumberingAfterBreak="0">
     <w:nsid w:val="7B454E97"/>
     <w:multiLevelType w:val="multilevel"/>
     <w:tmpl w:val="91888472"/>
@@ -3810,34 +4123,37 @@
     </w:lvl>
   </w:abstractNum>
   <w:num w:numId="1" w16cid:durableId="193857838">
+    <w:abstractNumId w:val="9"/>
+  </w:num>
+  <w:num w:numId="2" w16cid:durableId="950210425">
     <w:abstractNumId w:val="8"/>
   </w:num>
-  <w:num w:numId="2" w16cid:durableId="950210425">
-    <w:abstractNumId w:val="7"/>
-  </w:num>
   <w:num w:numId="3" w16cid:durableId="14773153">
-    <w:abstractNumId w:val="3"/>
+    <w:abstractNumId w:val="4"/>
   </w:num>
   <w:num w:numId="4" w16cid:durableId="1499079293">
-    <w:abstractNumId w:val="5"/>
+    <w:abstractNumId w:val="6"/>
   </w:num>
   <w:num w:numId="5" w16cid:durableId="1216090222">
     <w:abstractNumId w:val="0"/>
   </w:num>
   <w:num w:numId="6" w16cid:durableId="1045252710">
-    <w:abstractNumId w:val="9"/>
+    <w:abstractNumId w:val="10"/>
   </w:num>
   <w:num w:numId="7" w16cid:durableId="1982803398">
-    <w:abstractNumId w:val="6"/>
+    <w:abstractNumId w:val="7"/>
   </w:num>
   <w:num w:numId="8" w16cid:durableId="709187073">
+    <w:abstractNumId w:val="3"/>
+  </w:num>
+  <w:num w:numId="9" w16cid:durableId="1198812718">
     <w:abstractNumId w:val="2"/>
   </w:num>
-  <w:num w:numId="9" w16cid:durableId="1198812718">
+  <w:num w:numId="10" w16cid:durableId="1875652390">
+    <w:abstractNumId w:val="5"/>
+  </w:num>
+  <w:num w:numId="11" w16cid:durableId="1345354750">
     <w:abstractNumId w:val="1"/>
-  </w:num>
-  <w:num w:numId="10" w16cid:durableId="1875652390">
-    <w:abstractNumId w:val="4"/>
   </w:num>
 </w:numbering>
 </file>

</xml_diff>